<commit_message>
feat: CV bilingue EN/ES con toggle en vivo (ingles por defecto)
- data.json ahora bilingue { en, es } como fuente unica
- build-html: runtime i18n con switch EN/ES, persiste en localStorage
- build-docx: genera Carlo Rondon CV.docx (EN) y Carlo Rondon CV ES.docx
- perfil tech-first, venta de APIs de conectividad, wording internacional
- metricas concretas en experiencia Openpay

Co-Authored-By: Claude Opus 4.8 <noreply@anthropic.com>
</commit_message>
<xml_diff>
--- a/Carlo Rondon CV.docx
+++ b/Carlo Rondon CV.docx
@@ -29,7 +29,7 @@
           <w:color w:val="555566"/>
           <w:sz w:val="24"/>
         </w:rPr>
-        <w:t>Data · Growth · Micro SaaS · IA</w:t>
+        <w:t>Data · Growth · Micro SaaS · AI</w:t>
       </w:r>
     </w:p>
     <w:p>
@@ -44,7 +44,7 @@
           <w:color w:val="555566"/>
           <w:sz w:val="18"/>
         </w:rPr>
-        <w:t>Lima, Perú  ·  carlorndn@gmail.com  ·  +51936735897  ·  linkedin.com/in/carlo-rondon</w:t>
+        <w:t>Lima, Peru  ·  carlorndn@gmail.com  ·  +51936735897  ·  linkedin.com/in/carlo-rondon</w:t>
       </w:r>
     </w:p>
     <w:p>
@@ -62,7 +62,7 @@
           <w:color w:val="555566"/>
           <w:sz w:val="16"/>
         </w:rPr>
-        <w:t>PERFIL</w:t>
+        <w:t>PROFILE</w:t>
       </w:r>
     </w:p>
     <w:p>
@@ -76,7 +76,7 @@
           <w:color w:val="222233"/>
           <w:sz w:val="20"/>
         </w:rPr>
-        <w:t>Actualmente, Ejecutivo de Banca de Grandes Empresas en BBVA Perú, opero en la intersección entre datos, tecnología y negocio financiero. Diseño arquitecturas de datos y pipelines ETL sobre la nube, construyo modelos financieros y de pricing, y traduzco esa capacidad analítica en decisiones de producto y crecimiento. Con más de seis años entre banca, fintech y consultoría —y postgrado en management más certificaciones en ciencia de datos e ingeniería de datos en AWS— entiendo el negocio tan bien como el stack que lo sostiene. En paralelo desarrollo micro-SaaS y herramientas con inteligencia artificial: automatizo procesos, integro APIs y LLMs, y lanzo soluciones digitales escalables en mercados donde la tecnología financiera aún tiene todo por construir.</w:t>
+        <w:t>I'm a technical profile operating inside the financial world. Currently, as a Corporate &amp; Large-Enterprise Banking Executive at BBVA Peru, I design data architectures and cloud ETL pipelines, integrate and sell banking connectivity APIs that link corporate clients' systems to the bank's core, and automate processes with artificial intelligence. My edge isn't just understanding the business —I do, with over six years across banking, fintech and consulting, a postgraduate degree in management and certifications in data science and data engineering on AWS— but mastering the stack that makes it run: SQL, Python, cloud, APIs and LLMs. In parallel I build micro-SaaS and AI-powered tools, shipping scalable digital solutions in markets where financial technology still has everything left to build.</w:t>
       </w:r>
     </w:p>
     <w:p>
@@ -94,7 +94,7 @@
           <w:color w:val="555566"/>
           <w:sz w:val="16"/>
         </w:rPr>
-        <w:t>EXPERIENCIA PROFESIONAL</w:t>
+        <w:t>PROFESSIONAL EXPERIENCE</w:t>
       </w:r>
     </w:p>
     <w:p>
@@ -109,7 +109,7 @@
           <w:color w:val="0A0A0A"/>
           <w:sz w:val="24"/>
         </w:rPr>
-        <w:t>BBVA Perú</w:t>
+        <w:t>BBVA Peru</w:t>
       </w:r>
       <w:r>
         <w:rPr>
@@ -119,7 +119,7 @@
           <w:color w:val="555566"/>
           <w:sz w:val="18"/>
         </w:rPr>
-        <w:t xml:space="preserve">   Mayo 2022 – Actualidad  ·  3 años+</w:t>
+        <w:t xml:space="preserve">   May 2022 – Present  ·  3+ years</w:t>
       </w:r>
     </w:p>
     <w:p>
@@ -147,7 +147,7 @@
           <w:color w:val="555566"/>
           <w:sz w:val="18"/>
         </w:rPr>
-        <w:t>Banca Grandes Empresas</w:t>
+        <w:t>Corporate &amp; Large-Enterprise Banking</w:t>
       </w:r>
     </w:p>
     <w:p>
@@ -162,7 +162,7 @@
           <w:color w:val="555566"/>
           <w:sz w:val="18"/>
         </w:rPr>
-        <w:t>Mar 2026 – Actualidad</w:t>
+        <w:t>Mar 2026 – Present</w:t>
       </w:r>
     </w:p>
     <w:tbl>
@@ -203,7 +203,7 @@
                 <w:color w:val="0A0A0A"/>
                 <w:sz w:val="22"/>
               </w:rPr>
-              <w:t>Corporativo</w:t>
+              <w:t>APIs</w:t>
             </w:r>
           </w:p>
           <w:p>
@@ -218,7 +218,7 @@
                 <w:color w:val="555566"/>
                 <w:sz w:val="16"/>
               </w:rPr>
-              <w:t>Grandes empresas del Perú</w:t>
+              <w:t>Banking interconnection</w:t>
             </w:r>
           </w:p>
         </w:tc>
@@ -247,7 +247,7 @@
                 <w:color w:val="0A0A0A"/>
                 <w:sz w:val="22"/>
               </w:rPr>
-              <w:t>Modelos</w:t>
+              <w:t>Real-time</w:t>
             </w:r>
           </w:p>
           <w:p>
@@ -262,7 +262,7 @@
                 <w:color w:val="555566"/>
                 <w:sz w:val="16"/>
               </w:rPr>
-              <w:t>Financieros avanzados</w:t>
+              <w:t>Payments, collections &amp; reconciliation</w:t>
             </w:r>
           </w:p>
         </w:tc>
@@ -306,7 +306,7 @@
                 <w:color w:val="555566"/>
                 <w:sz w:val="16"/>
               </w:rPr>
-              <w:t>Nivel de interlocución</w:t>
+              <w:t>Level of engagement</w:t>
             </w:r>
           </w:p>
         </w:tc>
@@ -326,7 +326,7 @@
           <w:color w:val="222233"/>
           <w:sz w:val="20"/>
         </w:rPr>
-        <w:t xml:space="preserve">Diseño y construcción de </w:t>
+        <w:t xml:space="preserve">Sale and implementation of </w:t>
       </w:r>
       <w:r>
         <w:rPr>
@@ -335,7 +335,7 @@
           <w:color w:val="0A0A0A"/>
           <w:sz w:val="20"/>
         </w:rPr>
-        <w:t>modelos financieros</w:t>
+        <w:t>banking connectivity APIs</w:t>
       </w:r>
       <w:r>
         <w:rPr>
@@ -344,7 +344,7 @@
           <w:color w:val="222233"/>
           <w:sz w:val="20"/>
         </w:rPr>
-        <w:t xml:space="preserve"> para cartera Gran Empresa, proyectando escenarios de ROI y colocación de productos cash in/out que impulsan la digitalización e ingresos transaccionales.</w:t>
+        <w:t xml:space="preserve"> (host-to-host, ERP-to-bank integration and open banking) that interconnect corporate clients' treasury systems with the bank's core, automating payments, collections and reconciliation in real time.</w:t>
       </w:r>
     </w:p>
     <w:p>
@@ -360,7 +360,41 @@
           <w:color w:val="222233"/>
           <w:sz w:val="20"/>
         </w:rPr>
-        <w:t>Gestión ejecutiva de relación con las principales empresas del mercado peruano, presentando soluciones financieras integradas a comités directivos.</w:t>
+        <w:t xml:space="preserve">Design and construction of </w:t>
+      </w:r>
+      <w:r>
+        <w:rPr>
+          <w:rFonts w:ascii="Calibri" w:hAnsi="Calibri"/>
+          <w:b/>
+          <w:color w:val="0A0A0A"/>
+          <w:sz w:val="20"/>
+        </w:rPr>
+        <w:t>financial models</w:t>
+      </w:r>
+      <w:r>
+        <w:rPr>
+          <w:rFonts w:ascii="Calibri" w:hAnsi="Calibri"/>
+          <w:b w:val="0"/>
+          <w:color w:val="222233"/>
+          <w:sz w:val="20"/>
+        </w:rPr>
+        <w:t xml:space="preserve"> for the corporate-client portfolio, projecting ROI scenarios and cash in/out product placement that drive digitalization and transactional revenue.</w:t>
+      </w:r>
+    </w:p>
+    <w:p>
+      <w:pPr>
+        <w:pStyle w:val="ListBullet"/>
+        <w:spacing w:before="20" w:after="20"/>
+        <w:ind w:left="283"/>
+      </w:pPr>
+      <w:r>
+        <w:rPr>
+          <w:rFonts w:ascii="Calibri" w:hAnsi="Calibri"/>
+          <w:b w:val="0"/>
+          <w:color w:val="222233"/>
+          <w:sz w:val="20"/>
+        </w:rPr>
+        <w:t>Executive relationship management with Peru's leading corporations, driving the adoption of digital and connectivity solutions before executive committees.</w:t>
       </w:r>
     </w:p>
     <w:p>
@@ -388,7 +422,7 @@
           <w:color w:val="555566"/>
           <w:sz w:val="18"/>
         </w:rPr>
-        <w:t>Dic 2025 – Mar 2026</w:t>
+        <w:t>Dec 2025 – Mar 2026</w:t>
       </w:r>
     </w:p>
     <w:tbl>
@@ -444,7 +478,7 @@
                 <w:color w:val="555566"/>
                 <w:sz w:val="16"/>
               </w:rPr>
-              <w:t>Clientes activos</w:t>
+              <w:t>Active clients</w:t>
             </w:r>
           </w:p>
         </w:tc>
@@ -473,7 +507,7 @@
                 <w:color w:val="0A0A0A"/>
                 <w:sz w:val="22"/>
               </w:rPr>
-              <w:t>Exponencial</w:t>
+              <w:t>Exponential</w:t>
             </w:r>
           </w:p>
           <w:p>
@@ -488,7 +522,7 @@
                 <w:color w:val="555566"/>
                 <w:sz w:val="16"/>
               </w:rPr>
-              <w:t>Crecimiento en cash in</w:t>
+              <w:t>Cash-in growth</w:t>
             </w:r>
           </w:p>
         </w:tc>
@@ -517,7 +551,7 @@
                 <w:color w:val="0A0A0A"/>
                 <w:sz w:val="22"/>
               </w:rPr>
-              <w:t>Elasticidad</w:t>
+              <w:t>Elasticity</w:t>
             </w:r>
           </w:p>
           <w:p>
@@ -532,7 +566,7 @@
                 <w:color w:val="555566"/>
                 <w:sz w:val="16"/>
               </w:rPr>
-              <w:t>Análisis de pricing</w:t>
+              <w:t>Pricing analysis</w:t>
             </w:r>
           </w:p>
         </w:tc>
@@ -552,7 +586,7 @@
           <w:color w:val="222233"/>
           <w:sz w:val="20"/>
         </w:rPr>
-        <w:t xml:space="preserve">Optimización del </w:t>
+        <w:t xml:space="preserve">Optimization of the payments business </w:t>
       </w:r>
       <w:r>
         <w:rPr>
@@ -561,7 +595,7 @@
           <w:color w:val="0A0A0A"/>
           <w:sz w:val="20"/>
         </w:rPr>
-        <w:t>modelo de precios y promociones</w:t>
+        <w:t>pricing and promotions model</w:t>
       </w:r>
       <w:r>
         <w:rPr>
@@ -570,7 +604,7 @@
           <w:color w:val="222233"/>
           <w:sz w:val="20"/>
         </w:rPr>
-        <w:t xml:space="preserve"> del negocio de payments mediante análisis de elasticidad de demanda y segmentación avanzada de clientes, maximizando conversión y activación.</w:t>
+        <w:t xml:space="preserve"> through demand-elasticity analysis and advanced customer segmentation, maximizing conversion and activation.</w:t>
       </w:r>
     </w:p>
     <w:p>
@@ -613,7 +647,225 @@
           <w:color w:val="555566"/>
           <w:sz w:val="18"/>
         </w:rPr>
-        <w:t>Mar 2025 – Dic 2025</w:t>
+        <w:t>Mar 2025 – Dec 2025</w:t>
+      </w:r>
+    </w:p>
+    <w:tbl>
+      <w:tblPr>
+        <w:tblStyle w:val="TableGrid"/>
+        <w:tblW w:type="auto" w:w="0"/>
+        <w:jc w:val="left"/>
+        <w:tblLook w:firstColumn="1" w:firstRow="1" w:lastColumn="0" w:lastRow="0" w:noHBand="0" w:noVBand="1" w:val="04A0"/>
+      </w:tblPr>
+      <w:tblGrid>
+        <w:gridCol w:w="3135"/>
+        <w:gridCol w:w="3135"/>
+        <w:gridCol w:w="3135"/>
+      </w:tblGrid>
+      <w:tr>
+        <w:tc>
+          <w:tcPr>
+            <w:tcW w:type="dxa" w:w="3135"/>
+            <w:tcBorders>
+              <w:top w:val="none"/>
+              <w:left w:val="none"/>
+              <w:bottom w:val="none"/>
+              <w:right w:val="none"/>
+              <w:insideH w:val="none"/>
+              <w:insideV w:val="none"/>
+            </w:tcBorders>
+            <w:shd w:val="clear" w:color="auto" w:fill="F5F5F8"/>
+          </w:tcPr>
+          <w:p>
+            <w:pPr>
+              <w:spacing w:after="0"/>
+            </w:pPr>
+            <w:r>
+              <w:rPr>
+                <w:rFonts w:ascii="Calibri" w:hAnsi="Calibri"/>
+                <w:b/>
+                <w:i w:val="0"/>
+                <w:color w:val="0A0A0A"/>
+                <w:sz w:val="22"/>
+              </w:rPr>
+              <w:t>12 months</w:t>
+            </w:r>
+          </w:p>
+          <w:p>
+            <w:pPr>
+              <w:spacing w:before="20" w:after="0"/>
+            </w:pPr>
+            <w:r>
+              <w:rPr>
+                <w:rFonts w:ascii="Calibri" w:hAnsi="Calibri"/>
+                <w:b w:val="0"/>
+                <w:i w:val="0"/>
+                <w:color w:val="555566"/>
+                <w:sz w:val="16"/>
+              </w:rPr>
+              <w:t>Rollout to 3 areas</w:t>
+            </w:r>
+          </w:p>
+        </w:tc>
+        <w:tc>
+          <w:tcPr>
+            <w:tcW w:type="dxa" w:w="3135"/>
+            <w:tcBorders>
+              <w:top w:val="none"/>
+              <w:left w:val="none"/>
+              <w:bottom w:val="none"/>
+              <w:right w:val="none"/>
+              <w:insideH w:val="none"/>
+              <w:insideV w:val="none"/>
+            </w:tcBorders>
+            <w:shd w:val="clear" w:color="auto" w:fill="F5F5F8"/>
+          </w:tcPr>
+          <w:p>
+            <w:pPr>
+              <w:spacing w:after="0"/>
+            </w:pPr>
+            <w:r>
+              <w:rPr>
+                <w:rFonts w:ascii="Calibri" w:hAnsi="Calibri"/>
+                <w:b/>
+                <w:i w:val="0"/>
+                <w:color w:val="0A0A0A"/>
+                <w:sz w:val="22"/>
+              </w:rPr>
+              <w:t>In production</w:t>
+            </w:r>
+          </w:p>
+          <w:p>
+            <w:pPr>
+              <w:spacing w:before="20" w:after="0"/>
+            </w:pPr>
+            <w:r>
+              <w:rPr>
+                <w:rFonts w:ascii="Calibri" w:hAnsi="Calibri"/>
+                <w:b w:val="0"/>
+                <w:i w:val="0"/>
+                <w:color w:val="555566"/>
+                <w:sz w:val="16"/>
+              </w:rPr>
+              <w:t>Model still live today</w:t>
+            </w:r>
+          </w:p>
+        </w:tc>
+        <w:tc>
+          <w:tcPr>
+            <w:tcW w:type="dxa" w:w="3135"/>
+            <w:tcBorders>
+              <w:top w:val="none"/>
+              <w:left w:val="none"/>
+              <w:bottom w:val="none"/>
+              <w:right w:val="none"/>
+              <w:insideH w:val="none"/>
+              <w:insideV w:val="none"/>
+            </w:tcBorders>
+            <w:shd w:val="clear" w:color="auto" w:fill="F5F5F8"/>
+          </w:tcPr>
+          <w:p>
+            <w:pPr>
+              <w:spacing w:after="0"/>
+            </w:pPr>
+            <w:r>
+              <w:rPr>
+                <w:rFonts w:ascii="Calibri" w:hAnsi="Calibri"/>
+                <w:b/>
+                <w:i w:val="0"/>
+                <w:color w:val="0A0A0A"/>
+                <w:sz w:val="22"/>
+              </w:rPr>
+              <w:t>International HQ</w:t>
+            </w:r>
+          </w:p>
+          <w:p>
+            <w:pPr>
+              <w:spacing w:before="20" w:after="0"/>
+            </w:pPr>
+            <w:r>
+              <w:rPr>
+                <w:rFonts w:ascii="Calibri" w:hAnsi="Calibri"/>
+                <w:b w:val="0"/>
+                <w:i w:val="0"/>
+                <w:color w:val="555566"/>
+                <w:sz w:val="16"/>
+              </w:rPr>
+              <w:t>Model adoption</w:t>
+            </w:r>
+          </w:p>
+        </w:tc>
+      </w:tr>
+    </w:tbl>
+    <w:p/>
+    <w:p>
+      <w:pPr>
+        <w:pStyle w:val="ListBullet"/>
+        <w:spacing w:before="20" w:after="20"/>
+        <w:ind w:left="283"/>
+      </w:pPr>
+      <w:r>
+        <w:rPr>
+          <w:rFonts w:ascii="Calibri" w:hAnsi="Calibri"/>
+          <w:b w:val="0"/>
+          <w:color w:val="222233"/>
+          <w:sz w:val="20"/>
+        </w:rPr>
+        <w:t xml:space="preserve">Rolled the framework out over 12 months to </w:t>
+      </w:r>
+      <w:r>
+        <w:rPr>
+          <w:rFonts w:ascii="Calibri" w:hAnsi="Calibri"/>
+          <w:b/>
+          <w:color w:val="0A0A0A"/>
+          <w:sz w:val="20"/>
+        </w:rPr>
+        <w:t>Operations</w:t>
+      </w:r>
+      <w:r>
+        <w:rPr>
+          <w:rFonts w:ascii="Calibri" w:hAnsi="Calibri"/>
+          <w:b w:val="0"/>
+          <w:color w:val="222233"/>
+          <w:sz w:val="20"/>
+        </w:rPr>
+        <w:t xml:space="preserve"> (post-sale prioritization by transaction value and growth projection), </w:t>
+      </w:r>
+      <w:r>
+        <w:rPr>
+          <w:rFonts w:ascii="Calibri" w:hAnsi="Calibri"/>
+          <w:b/>
+          <w:color w:val="0A0A0A"/>
+          <w:sz w:val="20"/>
+        </w:rPr>
+        <w:t>Marketing</w:t>
+      </w:r>
+      <w:r>
+        <w:rPr>
+          <w:rFonts w:ascii="Calibri" w:hAnsi="Calibri"/>
+          <w:b w:val="0"/>
+          <w:color w:val="222233"/>
+          <w:sz w:val="20"/>
+        </w:rPr>
+        <w:t xml:space="preserve"> (segment focus on e-commerce) and </w:t>
+      </w:r>
+      <w:r>
+        <w:rPr>
+          <w:rFonts w:ascii="Calibri" w:hAnsi="Calibri"/>
+          <w:b/>
+          <w:color w:val="0A0A0A"/>
+          <w:sz w:val="20"/>
+        </w:rPr>
+        <w:t>Fraud</w:t>
+      </w:r>
+      <w:r>
+        <w:rPr>
+          <w:rFonts w:ascii="Calibri" w:hAnsi="Calibri"/>
+          <w:b w:val="0"/>
+          <w:color w:val="222233"/>
+          <w:sz w:val="20"/>
+        </w:rPr>
+        <w:t xml:space="preserve"> (commercial signals the detection engine hadn't mapped yet), with Peru's country manager as executive sponsor.</w:t>
       </w:r>
     </w:p>
     <w:p>
@@ -629,7 +881,7 @@
           <w:color w:val="222233"/>
           <w:sz w:val="20"/>
         </w:rPr>
-        <w:t xml:space="preserve">Elaboración de </w:t>
+        <w:t xml:space="preserve">The model </w:t>
       </w:r>
       <w:r>
         <w:rPr>
@@ -638,7 +890,7 @@
           <w:color w:val="0A0A0A"/>
           <w:sz w:val="20"/>
         </w:rPr>
-        <w:t>business cases para clientes estratégicos</w:t>
+        <w:t>remains in production today</w:t>
       </w:r>
       <w:r>
         <w:rPr>
@@ -647,41 +899,7 @@
           <w:color w:val="222233"/>
           <w:sz w:val="20"/>
         </w:rPr>
-        <w:t xml:space="preserve"> y presentaciones a directorios C-level locales e internacionales, sustentando decisiones de inversión y expansión del negocio fintech.</w:t>
-      </w:r>
-    </w:p>
-    <w:p>
-      <w:pPr>
-        <w:pStyle w:val="ListBullet"/>
-        <w:spacing w:before="20" w:after="20"/>
-        <w:ind w:left="283"/>
-      </w:pPr>
-      <w:r>
-        <w:rPr>
-          <w:rFonts w:ascii="Calibri" w:hAnsi="Calibri"/>
-          <w:b w:val="0"/>
-          <w:color w:val="222233"/>
-          <w:sz w:val="20"/>
-        </w:rPr>
-        <w:t xml:space="preserve">Coordinación autónoma de </w:t>
-      </w:r>
-      <w:r>
-        <w:rPr>
-          <w:rFonts w:ascii="Calibri" w:hAnsi="Calibri"/>
-          <w:b/>
-          <w:color w:val="0A0A0A"/>
-          <w:sz w:val="20"/>
-        </w:rPr>
-        <w:t>equipos transversales</w:t>
-      </w:r>
-      <w:r>
-        <w:rPr>
-          <w:rFonts w:ascii="Calibri" w:hAnsi="Calibri"/>
-          <w:b w:val="0"/>
-          <w:color w:val="222233"/>
-          <w:sz w:val="20"/>
-        </w:rPr>
-        <w:t xml:space="preserve"> (tecnología, marketing, operaciones) para la ejecución de automatizaciones e iniciativas comerciales de alto impacto.</w:t>
+        <w:t xml:space="preserve"> and was adopted by the international HQ in Mexico, whose fraud team requested the commercial dataset.</w:t>
       </w:r>
     </w:p>
     <w:p>
@@ -724,7 +942,207 @@
           <w:color w:val="555566"/>
           <w:sz w:val="18"/>
         </w:rPr>
-        <w:t>Mayo 2022 – Mar 2025</w:t>
+        <w:t>May 2022 – Mar 2025</w:t>
+      </w:r>
+    </w:p>
+    <w:tbl>
+      <w:tblPr>
+        <w:tblStyle w:val="TableGrid"/>
+        <w:tblW w:type="auto" w:w="0"/>
+        <w:jc w:val="left"/>
+        <w:tblLook w:firstColumn="1" w:firstRow="1" w:lastColumn="0" w:lastRow="0" w:noHBand="0" w:noVBand="1" w:val="04A0"/>
+      </w:tblPr>
+      <w:tblGrid>
+        <w:gridCol w:w="3135"/>
+        <w:gridCol w:w="3135"/>
+        <w:gridCol w:w="3135"/>
+      </w:tblGrid>
+      <w:tr>
+        <w:tc>
+          <w:tcPr>
+            <w:tcW w:type="dxa" w:w="3135"/>
+            <w:tcBorders>
+              <w:top w:val="none"/>
+              <w:left w:val="none"/>
+              <w:bottom w:val="none"/>
+              <w:right w:val="none"/>
+              <w:insideH w:val="none"/>
+              <w:insideV w:val="none"/>
+            </w:tcBorders>
+            <w:shd w:val="clear" w:color="auto" w:fill="F5F5F8"/>
+          </w:tcPr>
+          <w:p>
+            <w:pPr>
+              <w:spacing w:after="0"/>
+            </w:pPr>
+            <w:r>
+              <w:rPr>
+                <w:rFonts w:ascii="Calibri" w:hAnsi="Calibri"/>
+                <w:b/>
+                <w:i w:val="0"/>
+                <w:color w:val="0A0A0A"/>
+                <w:sz w:val="22"/>
+              </w:rPr>
+              <w:t>&lt;100 → 40K+</w:t>
+            </w:r>
+          </w:p>
+          <w:p>
+            <w:pPr>
+              <w:spacing w:before="20" w:after="0"/>
+            </w:pPr>
+            <w:r>
+              <w:rPr>
+                <w:rFonts w:ascii="Calibri" w:hAnsi="Calibri"/>
+                <w:b w:val="0"/>
+                <w:i w:val="0"/>
+                <w:color w:val="555566"/>
+                <w:sz w:val="16"/>
+              </w:rPr>
+              <w:t>Merchants as it scaled</w:t>
+            </w:r>
+          </w:p>
+        </w:tc>
+        <w:tc>
+          <w:tcPr>
+            <w:tcW w:type="dxa" w:w="3135"/>
+            <w:tcBorders>
+              <w:top w:val="none"/>
+              <w:left w:val="none"/>
+              <w:bottom w:val="none"/>
+              <w:right w:val="none"/>
+              <w:insideH w:val="none"/>
+              <w:insideV w:val="none"/>
+            </w:tcBorders>
+            <w:shd w:val="clear" w:color="auto" w:fill="F5F5F8"/>
+          </w:tcPr>
+          <w:p>
+            <w:pPr>
+              <w:spacing w:after="0"/>
+            </w:pPr>
+            <w:r>
+              <w:rPr>
+                <w:rFonts w:ascii="Calibri" w:hAnsi="Calibri"/>
+                <w:b/>
+                <w:i w:val="0"/>
+                <w:color w:val="0A0A0A"/>
+                <w:sz w:val="22"/>
+              </w:rPr>
+              <w:t>2% → 8%</w:t>
+            </w:r>
+          </w:p>
+          <w:p>
+            <w:pPr>
+              <w:spacing w:before="20" w:after="0"/>
+            </w:pPr>
+            <w:r>
+              <w:rPr>
+                <w:rFonts w:ascii="Calibri" w:hAnsi="Calibri"/>
+                <w:b w:val="0"/>
+                <w:i w:val="0"/>
+                <w:color w:val="555566"/>
+                <w:sz w:val="16"/>
+              </w:rPr>
+              <w:t>Lead conversion</w:t>
+            </w:r>
+          </w:p>
+        </w:tc>
+        <w:tc>
+          <w:tcPr>
+            <w:tcW w:type="dxa" w:w="3135"/>
+            <w:tcBorders>
+              <w:top w:val="none"/>
+              <w:left w:val="none"/>
+              <w:bottom w:val="none"/>
+              <w:right w:val="none"/>
+              <w:insideH w:val="none"/>
+              <w:insideV w:val="none"/>
+            </w:tcBorders>
+            <w:shd w:val="clear" w:color="auto" w:fill="F5F5F8"/>
+          </w:tcPr>
+          <w:p>
+            <w:pPr>
+              <w:spacing w:after="0"/>
+            </w:pPr>
+            <w:r>
+              <w:rPr>
+                <w:rFonts w:ascii="Calibri" w:hAnsi="Calibri"/>
+                <w:b/>
+                <w:i w:val="0"/>
+                <w:color w:val="0A0A0A"/>
+                <w:sz w:val="22"/>
+              </w:rPr>
+              <w:t>19% → 42%</w:t>
+            </w:r>
+          </w:p>
+          <w:p>
+            <w:pPr>
+              <w:spacing w:before="20" w:after="0"/>
+            </w:pPr>
+            <w:r>
+              <w:rPr>
+                <w:rFonts w:ascii="Calibri" w:hAnsi="Calibri"/>
+                <w:b w:val="0"/>
+                <w:i w:val="0"/>
+                <w:color w:val="555566"/>
+                <w:sz w:val="16"/>
+              </w:rPr>
+              <w:t>Junk-lead rejection</w:t>
+            </w:r>
+          </w:p>
+        </w:tc>
+      </w:tr>
+    </w:tbl>
+    <w:p/>
+    <w:p>
+      <w:pPr>
+        <w:pStyle w:val="ListBullet"/>
+        <w:spacing w:before="20" w:after="20"/>
+        <w:ind w:left="283"/>
+      </w:pPr>
+      <w:r>
+        <w:rPr>
+          <w:rFonts w:ascii="Calibri" w:hAnsi="Calibri"/>
+          <w:b w:val="0"/>
+          <w:color w:val="222233"/>
+          <w:sz w:val="20"/>
+        </w:rPr>
+        <w:t xml:space="preserve">Joined a </w:t>
+      </w:r>
+      <w:r>
+        <w:rPr>
+          <w:rFonts w:ascii="Calibri" w:hAnsi="Calibri"/>
+          <w:b/>
+          <w:color w:val="0A0A0A"/>
+          <w:sz w:val="20"/>
+        </w:rPr>
+        <w:t>BBVA payments fintech</w:t>
+      </w:r>
+      <w:r>
+        <w:rPr>
+          <w:rFonts w:ascii="Calibri" w:hAnsi="Calibri"/>
+          <w:b w:val="0"/>
+          <w:color w:val="222233"/>
+          <w:sz w:val="20"/>
+        </w:rPr>
+        <w:t xml:space="preserve"> serving fewer than 100 merchants with no defined data processes: decisions ran on a weekly spreadsheet and a monthly results deck. I built </w:t>
+      </w:r>
+      <w:r>
+        <w:rPr>
+          <w:rFonts w:ascii="Calibri" w:hAnsi="Calibri"/>
+          <w:b/>
+          <w:color w:val="0A0A0A"/>
+          <w:sz w:val="20"/>
+        </w:rPr>
+        <w:t>predictive models and daily-cut reporting</w:t>
+      </w:r>
+      <w:r>
+        <w:rPr>
+          <w:rFonts w:ascii="Calibri" w:hAnsi="Calibri"/>
+          <w:b w:val="0"/>
+          <w:color w:val="222233"/>
+          <w:sz w:val="20"/>
+        </w:rPr>
+        <w:t xml:space="preserve"> that became the decision layer for four teams as the business scaled past 40,000 merchants.</w:t>
       </w:r>
     </w:p>
     <w:p>
@@ -740,7 +1158,7 @@
           <w:color w:val="222233"/>
           <w:sz w:val="20"/>
         </w:rPr>
-        <w:t xml:space="preserve">Liderazgo autónomo del </w:t>
+        <w:t xml:space="preserve">Lifted </w:t>
       </w:r>
       <w:r>
         <w:rPr>
@@ -749,7 +1167,7 @@
           <w:color w:val="0A0A0A"/>
           <w:sz w:val="20"/>
         </w:rPr>
-        <w:t>proyecto de arquitectura de datos de Openpay</w:t>
+        <w:t>commercial lead conversion from 2% to 8%</w:t>
       </w:r>
       <w:r>
         <w:rPr>
@@ -758,41 +1176,7 @@
           <w:color w:val="222233"/>
           <w:sz w:val="20"/>
         </w:rPr>
-        <w:t>: diseño e implementación de pipelines ETL que cumplieron los estándares de gobierno de datos bancario, superando los tiempos de entrega durante una etapa de hipercrecimiento.</w:t>
-      </w:r>
-    </w:p>
-    <w:p>
-      <w:pPr>
-        <w:pStyle w:val="ListBullet"/>
-        <w:spacing w:before="20" w:after="20"/>
-        <w:ind w:left="283"/>
-      </w:pPr>
-      <w:r>
-        <w:rPr>
-          <w:rFonts w:ascii="Calibri" w:hAnsi="Calibri"/>
-          <w:b w:val="0"/>
-          <w:color w:val="222233"/>
-          <w:sz w:val="20"/>
-        </w:rPr>
-        <w:t xml:space="preserve">Automatización de procesos de datos que redujeron tiempos de reporte y habilitaron </w:t>
-      </w:r>
-      <w:r>
-        <w:rPr>
-          <w:rFonts w:ascii="Calibri" w:hAnsi="Calibri"/>
-          <w:b/>
-          <w:color w:val="0A0A0A"/>
-          <w:sz w:val="20"/>
-        </w:rPr>
-        <w:t>análisis en tiempo real</w:t>
-      </w:r>
-      <w:r>
-        <w:rPr>
-          <w:rFonts w:ascii="Calibri" w:hAnsi="Calibri"/>
-          <w:b w:val="0"/>
-          <w:color w:val="222233"/>
-          <w:sz w:val="20"/>
-        </w:rPr>
-        <w:t xml:space="preserve"> para la toma de decisiones comerciales.</w:t>
+        <w:t xml:space="preserve"> in under three months by scoring lead quality, raising junk-lead rejection from 19% to 42% and refocusing sales effort on winnable accounts.</w:t>
       </w:r>
     </w:p>
     <w:p>
@@ -817,7 +1201,7 @@
           <w:color w:val="555566"/>
           <w:sz w:val="18"/>
         </w:rPr>
-        <w:t>SQL  ·  Python  ·  Power BI  ·  AWS  ·  ETL  ·  Modelado financiero  ·  Pricing  ·  Salesforce</w:t>
+        <w:t>SQL  ·  Python  ·  Power BI  ·  AWS  ·  ETL  ·  Financial modeling  ·  Pricing  ·  Salesforce</w:t>
       </w:r>
     </w:p>
     <w:p>
@@ -832,7 +1216,7 @@
           <w:color w:val="0A0A0A"/>
           <w:sz w:val="24"/>
         </w:rPr>
-        <w:t>PwC Perú</w:t>
+        <w:t>PwC Peru</w:t>
       </w:r>
       <w:r>
         <w:rPr>
@@ -842,7 +1226,7 @@
           <w:color w:val="555566"/>
           <w:sz w:val="18"/>
         </w:rPr>
-        <w:t xml:space="preserve">   Septiembre 2019 – Mayo 2022  ·  2a 8m</w:t>
+        <w:t xml:space="preserve">   September 2019 – May 2022  ·  2y 8m</w:t>
       </w:r>
     </w:p>
     <w:p>
@@ -870,7 +1254,7 @@
           <w:color w:val="555566"/>
           <w:sz w:val="18"/>
         </w:rPr>
-        <w:t>Ago 2020 – Mayo 2022</w:t>
+        <w:t>Aug 2020 – May 2022</w:t>
       </w:r>
     </w:p>
     <w:tbl>
@@ -925,7 +1309,7 @@
                 <w:color w:val="555566"/>
                 <w:sz w:val="16"/>
               </w:rPr>
-              <w:t>Desempeño firma (2019–2020)</w:t>
+              <w:t>Firm performance (2019–2020)</w:t>
             </w:r>
           </w:p>
         </w:tc>
@@ -969,7 +1353,7 @@
                 <w:color w:val="555566"/>
                 <w:sz w:val="16"/>
               </w:rPr>
-              <w:t>Iniciativas de datos lideradas</w:t>
+              <w:t>Data initiatives led</w:t>
             </w:r>
           </w:p>
         </w:tc>
@@ -989,7 +1373,7 @@
           <w:color w:val="222233"/>
           <w:sz w:val="20"/>
         </w:rPr>
-        <w:t xml:space="preserve">Liderazgo de </w:t>
+        <w:t xml:space="preserve">Led </w:t>
       </w:r>
       <w:r>
         <w:rPr>
@@ -998,7 +1382,7 @@
           <w:color w:val="0A0A0A"/>
           <w:sz w:val="20"/>
         </w:rPr>
-        <w:t>más de 10 iniciativas comerciales y de datos</w:t>
+        <w:t>10+ commercial and data initiatives</w:t>
       </w:r>
       <w:r>
         <w:rPr>
@@ -1007,7 +1391,7 @@
           <w:color w:val="222233"/>
           <w:sz w:val="20"/>
         </w:rPr>
-        <w:t>, incrementando significativamente la detección de oportunidades para las líneas de servicio de la firma.</w:t>
+        <w:t>, significantly increasing opportunity detection across the firm's service lines.</w:t>
       </w:r>
     </w:p>
     <w:p>
@@ -1023,7 +1407,7 @@
           <w:color w:val="222233"/>
           <w:sz w:val="20"/>
         </w:rPr>
-        <w:t xml:space="preserve">Soporte analítico y comercial a Auditoría, </w:t>
+        <w:t xml:space="preserve">Analytical and commercial support to Audit, </w:t>
       </w:r>
       <w:r>
         <w:rPr>
@@ -1032,7 +1416,7 @@
           <w:color w:val="0A0A0A"/>
           <w:sz w:val="20"/>
         </w:rPr>
-        <w:t>principal línea de ingresos de PwC Perú</w:t>
+        <w:t>PwC Peru's main revenue line</w:t>
       </w:r>
       <w:r>
         <w:rPr>
@@ -1041,7 +1425,7 @@
           <w:color w:val="222233"/>
           <w:sz w:val="20"/>
         </w:rPr>
-        <w:t>, en el diseño e implementación de estrategias de crecimiento.</w:t>
+        <w:t>, in designing and implementing growth strategies.</w:t>
       </w:r>
     </w:p>
     <w:p>
@@ -1057,7 +1441,7 @@
           <w:color w:val="222233"/>
           <w:sz w:val="20"/>
         </w:rPr>
-        <w:t xml:space="preserve">Reconocido con </w:t>
+        <w:t xml:space="preserve">Recognized with </w:t>
       </w:r>
       <w:r>
         <w:rPr>
@@ -1066,7 +1450,7 @@
           <w:color w:val="0A0A0A"/>
           <w:sz w:val="20"/>
         </w:rPr>
-        <w:t>desempeño superior al percentil 90</w:t>
+        <w:t>performance above the 90th percentile</w:t>
       </w:r>
       <w:r>
         <w:rPr>
@@ -1075,7 +1459,7 @@
           <w:color w:val="222233"/>
           <w:sz w:val="20"/>
         </w:rPr>
-        <w:t xml:space="preserve"> de la firma durante dos años consecutivos (2019 y 2020).</w:t>
+        <w:t xml:space="preserve"> of the firm for two consecutive years (2019 and 2020).</w:t>
       </w:r>
     </w:p>
     <w:p>
@@ -1103,7 +1487,7 @@
           <w:color w:val="555566"/>
           <w:sz w:val="18"/>
         </w:rPr>
-        <w:t>Sep 2019 – Ago 2020</w:t>
+        <w:t>Sep 2019 – Aug 2020</w:t>
       </w:r>
     </w:p>
     <w:tbl>
@@ -1158,7 +1542,7 @@
                 <w:color w:val="555566"/>
                 <w:sz w:val="16"/>
               </w:rPr>
-              <w:t>Colaboradores capacitados</w:t>
+              <w:t>Staff trained</w:t>
             </w:r>
           </w:p>
         </w:tc>
@@ -1187,7 +1571,7 @@
                 <w:color w:val="0A0A0A"/>
                 <w:sz w:val="22"/>
               </w:rPr>
-              <w:t>Nacional</w:t>
+              <w:t>Nationwide</w:t>
             </w:r>
           </w:p>
           <w:p>
@@ -1202,7 +1586,7 @@
                 <w:color w:val="555566"/>
                 <w:sz w:val="16"/>
               </w:rPr>
-              <w:t>Alcance del proyecto Salesforce</w:t>
+              <w:t>Salesforce project scope</w:t>
             </w:r>
           </w:p>
         </w:tc>
@@ -1222,7 +1606,7 @@
           <w:color w:val="222233"/>
           <w:sz w:val="20"/>
         </w:rPr>
-        <w:t xml:space="preserve">Liderazgo de la </w:t>
+        <w:t xml:space="preserve">Led the </w:t>
       </w:r>
       <w:r>
         <w:rPr>
@@ -1231,7 +1615,7 @@
           <w:color w:val="0A0A0A"/>
           <w:sz w:val="20"/>
         </w:rPr>
-        <w:t>migración a Salesforce</w:t>
+        <w:t>Salesforce migration</w:t>
       </w:r>
       <w:r>
         <w:rPr>
@@ -1240,7 +1624,7 @@
           <w:color w:val="222233"/>
           <w:sz w:val="20"/>
         </w:rPr>
-        <w:t xml:space="preserve"> a nivel Perú, diseñando el plan de capacitación y formando a más de 700 colaboradores de la firma en el nuevo sistema CRM.</w:t>
+        <w:t xml:space="preserve"> across Peru, designing the training plan and onboarding 700+ of the firm's staff onto the new CRM system.</w:t>
       </w:r>
     </w:p>
     <w:p>
@@ -1265,7 +1649,7 @@
           <w:color w:val="555566"/>
           <w:sz w:val="18"/>
         </w:rPr>
-        <w:t>Business Intelligence  ·  Análisis comercial  ·  Salesforce  ·  Consultoría</w:t>
+        <w:t>Business Intelligence  ·  Commercial analysis  ·  Salesforce  ·  Consulting</w:t>
       </w:r>
     </w:p>
     <w:p>
@@ -1280,7 +1664,7 @@
           <w:color w:val="0A0A0A"/>
           <w:sz w:val="24"/>
         </w:rPr>
-        <w:t>Scotiabank Perú</w:t>
+        <w:t>Scotiabank Peru</w:t>
       </w:r>
       <w:r>
         <w:rPr>
@@ -1290,7 +1674,7 @@
           <w:color w:val="555566"/>
           <w:sz w:val="18"/>
         </w:rPr>
-        <w:t xml:space="preserve">   Febrero – Octubre 2019  ·  9 meses</w:t>
+        <w:t xml:space="preserve">   February – October 2019  ·  9 months</w:t>
       </w:r>
     </w:p>
     <w:p>
@@ -1373,7 +1757,7 @@
                 <w:color w:val="555566"/>
                 <w:sz w:val="16"/>
               </w:rPr>
-              <w:t>Iniciativas de mejora CX</w:t>
+              <w:t>CX improvement initiatives</w:t>
             </w:r>
           </w:p>
         </w:tc>
@@ -1417,7 +1801,7 @@
                 <w:color w:val="555566"/>
                 <w:sz w:val="16"/>
               </w:rPr>
-              <w:t>Segmentos de clientes</w:t>
+              <w:t>Customer segments</w:t>
             </w:r>
           </w:p>
         </w:tc>
@@ -1437,7 +1821,7 @@
           <w:color w:val="222233"/>
           <w:sz w:val="20"/>
         </w:rPr>
-        <w:t xml:space="preserve">Diseño de </w:t>
+        <w:t xml:space="preserve">Designed </w:t>
       </w:r>
       <w:r>
         <w:rPr>
@@ -1446,7 +1830,7 @@
           <w:color w:val="0A0A0A"/>
           <w:sz w:val="20"/>
         </w:rPr>
-        <w:t>métricas de fidelización</w:t>
+        <w:t>loyalty metrics</w:t>
       </w:r>
       <w:r>
         <w:rPr>
@@ -1455,7 +1839,7 @@
           <w:color w:val="222233"/>
           <w:sz w:val="20"/>
         </w:rPr>
-        <w:t xml:space="preserve"> para segmentos retail y wholesale, evaluando el impacto de campañas sobre la base de clientes del banco.</w:t>
+        <w:t xml:space="preserve"> for retail and wholesale segments, assessing campaign impact on the bank's customer base.</w:t>
       </w:r>
     </w:p>
     <w:p>
@@ -1471,7 +1855,7 @@
           <w:color w:val="222233"/>
           <w:sz w:val="20"/>
         </w:rPr>
-        <w:t xml:space="preserve">Participación activa en </w:t>
+        <w:t xml:space="preserve">Active participation in </w:t>
       </w:r>
       <w:r>
         <w:rPr>
@@ -1480,7 +1864,7 @@
           <w:color w:val="0A0A0A"/>
           <w:sz w:val="20"/>
         </w:rPr>
-        <w:t>5 iniciativas exitosas</w:t>
+        <w:t>5 successful initiatives</w:t>
       </w:r>
       <w:r>
         <w:rPr>
@@ -1489,7 +1873,7 @@
           <w:color w:val="222233"/>
           <w:sz w:val="20"/>
         </w:rPr>
-        <w:t xml:space="preserve"> de mejora de experiencia del cliente.</w:t>
+        <w:t xml:space="preserve"> to improve customer experience.</w:t>
       </w:r>
     </w:p>
     <w:p>
@@ -1507,7 +1891,7 @@
           <w:color w:val="555566"/>
           <w:sz w:val="16"/>
         </w:rPr>
-        <w:t>EDUCACIÓN</w:t>
+        <w:t>EDUCATION</w:t>
       </w:r>
     </w:p>
     <w:p>
@@ -1537,7 +1921,7 @@
           <w:color w:val="555566"/>
           <w:sz w:val="18"/>
         </w:rPr>
-        <w:t>Pacífico Business School · Lima, Perú  ·  Postgrado · 2024</w:t>
+        <w:t>Pacífico Business School · Lima, Peru  ·  Postgraduate · 2024</w:t>
       </w:r>
     </w:p>
     <w:p>
@@ -1552,7 +1936,7 @@
           <w:color w:val="0A0A0A"/>
           <w:sz w:val="22"/>
         </w:rPr>
-        <w:t>Bachiller en Marketing</w:t>
+        <w:t>Bachelor in Marketing</w:t>
       </w:r>
     </w:p>
     <w:p>
@@ -1567,7 +1951,7 @@
           <w:color w:val="555566"/>
           <w:sz w:val="18"/>
         </w:rPr>
-        <w:t>Universidad del Pacífico · Lima, Perú  ·  Pregrado · 2021</w:t>
+        <w:t>Universidad del Pacífico · Lima, Peru  ·  Undergraduate · 2021</w:t>
       </w:r>
     </w:p>
     <w:p>
@@ -1585,7 +1969,7 @@
           <w:color w:val="555566"/>
           <w:sz w:val="16"/>
         </w:rPr>
-        <w:t>CERTIFICACIONES</w:t>
+        <w:t>CERTIFICATIONS</w:t>
       </w:r>
     </w:p>
     <w:p>
@@ -1740,7 +2124,7 @@
           <w:color w:val="B45E09"/>
           <w:sz w:val="18"/>
         </w:rPr>
-        <w:t xml:space="preserve">[En curso]  </w:t>
+        <w:t xml:space="preserve">[In progress]  </w:t>
       </w:r>
       <w:r>
         <w:rPr>
@@ -1775,7 +2159,7 @@
           <w:color w:val="B45E09"/>
           <w:sz w:val="18"/>
         </w:rPr>
-        <w:t xml:space="preserve">[En curso]  </w:t>
+        <w:t xml:space="preserve">[In progress]  </w:t>
       </w:r>
       <w:r>
         <w:rPr>
@@ -1810,7 +2194,7 @@
           <w:color w:val="B45E09"/>
           <w:sz w:val="18"/>
         </w:rPr>
-        <w:t xml:space="preserve">[En curso]  </w:t>
+        <w:t xml:space="preserve">[In progress]  </w:t>
       </w:r>
       <w:r>
         <w:rPr>
@@ -1848,7 +2232,7 @@
           <w:color w:val="555566"/>
           <w:sz w:val="16"/>
         </w:rPr>
-        <w:t>IDIOMAS</w:t>
+        <w:t>LANGUAGES</w:t>
       </w:r>
     </w:p>
     <w:p>
@@ -1863,7 +2247,7 @@
           <w:color w:val="0A0A0A"/>
           <w:sz w:val="20"/>
         </w:rPr>
-        <w:t>Español  —  Nativo</w:t>
+        <w:t>Spanish  —  Native</w:t>
       </w:r>
     </w:p>
     <w:p>
@@ -1878,7 +2262,7 @@
           <w:color w:val="0A0A0A"/>
           <w:sz w:val="20"/>
         </w:rPr>
-        <w:t>Inglés  —  Profesional</w:t>
+        <w:t>English  —  Professional</w:t>
       </w:r>
       <w:r>
         <w:rPr>
@@ -1903,7 +2287,7 @@
           <w:color w:val="0A0A0A"/>
           <w:sz w:val="20"/>
         </w:rPr>
-        <w:t>Italiano  —  Conversacional</w:t>
+        <w:t>Italian  —  Conversational</w:t>
       </w:r>
     </w:p>
     <w:sectPr>

</xml_diff>